<commit_message>
Actualizo semana 04 y agrego RF Farmacia
</commit_message>
<xml_diff>
--- a/semana-04/GLAB-S04-RCOELLO-2026-01.docx
+++ b/semana-04/GLAB-S04-RCOELLO-2026-01.docx
@@ -26728,6 +26728,71 @@
         </w:rPr>
         <w:t xml:space="preserve"> tradicionales.</w:t>
       </w:r>
+    </w:p>
+    <w:p>
+      <w:pPr>
+        <w:tabs>
+          <w:tab w:val="left" w:pos="1200"/>
+        </w:tabs>
+        <w:jc w:val="both"/>
+        <w:rPr>
+          <w:rFonts w:ascii="Times New Roman" w:eastAsiaTheme="minorHAnsi" w:hAnsi="Times New Roman" w:cs="Times New Roman"/>
+          <w:lang w:eastAsia="en-US"/>
+        </w:rPr>
+      </w:pPr>
+    </w:p>
+    <w:p>
+      <w:pPr>
+        <w:tabs>
+          <w:tab w:val="left" w:pos="1200"/>
+        </w:tabs>
+        <w:jc w:val="both"/>
+        <w:rPr>
+          <w:rFonts w:ascii="Times New Roman" w:eastAsiaTheme="minorHAnsi" w:hAnsi="Times New Roman" w:cs="Times New Roman"/>
+          <w:lang w:eastAsia="en-US"/>
+        </w:rPr>
+      </w:pPr>
+      <w:r>
+        <w:rPr>
+          <w:rFonts w:ascii="Times New Roman" w:eastAsiaTheme="minorHAnsi" w:hAnsi="Times New Roman" w:cs="Times New Roman"/>
+          <w:lang w:eastAsia="en-US"/>
+        </w:rPr>
+        <w:t>GitHub:</w:t>
+      </w:r>
+    </w:p>
+    <w:p>
+      <w:pPr>
+        <w:tabs>
+          <w:tab w:val="left" w:pos="1200"/>
+        </w:tabs>
+        <w:jc w:val="both"/>
+        <w:rPr>
+          <w:rFonts w:ascii="Times New Roman" w:eastAsiaTheme="minorHAnsi" w:hAnsi="Times New Roman" w:cs="Times New Roman"/>
+          <w:lang w:eastAsia="en-US"/>
+        </w:rPr>
+      </w:pPr>
+      <w:hyperlink r:id="rId47" w:history="1">
+        <w:r>
+          <w:rPr>
+            <w:rStyle w:val="Hipervnculo"/>
+            <w:rFonts w:ascii="Times New Roman" w:eastAsiaTheme="minorHAnsi" w:hAnsi="Times New Roman" w:cs="Times New Roman"/>
+            <w:lang w:eastAsia="en-US"/>
+          </w:rPr>
+          <w:t>https://github.com/juandiegoramosenriquez-sys/Desarrollo-De-Aplicaciones-Web/tree/main/semana-04</w:t>
+        </w:r>
+      </w:hyperlink>
+    </w:p>
+    <w:p>
+      <w:pPr>
+        <w:tabs>
+          <w:tab w:val="left" w:pos="1200"/>
+        </w:tabs>
+        <w:jc w:val="both"/>
+        <w:rPr>
+          <w:rFonts w:ascii="Times New Roman" w:eastAsiaTheme="minorHAnsi" w:hAnsi="Times New Roman" w:cs="Times New Roman"/>
+          <w:lang w:eastAsia="en-US"/>
+        </w:rPr>
+      </w:pPr>
     </w:p>
     <w:sectPr>
       <w:pgSz w:w="11906" w:h="16838" w:code="9"/>

</xml_diff>